<commit_message>
Improve FusionVI missing-panel benchmark
</commit_message>
<xml_diff>
--- a/deliverables/FusionVI_Paper_Benchmark_Technical_Report.docx
+++ b/deliverables/FusionVI_Paper_Benchmark_Technical_Report.docx
@@ -44,7 +44,7 @@
     </w:p>
     <w:p>
       <w:r>
-        <w:t>Therapeutic biomarker studies often combine sparse transcript counts with surface-protein measurements, but entire protein panels may be unavailable in a new batch. We reproduced the totalVI paper's Figure 3 missing-protein design on the official SLN111 CITE-seq object and compared the published totalVI architecture with FusionVI, which replaces the joint encoder with separate RNA and protein branches and a learned cell-level gate. Across 5 paired random initializations and 110 proteins, The models were nearly tied: FusionVI RMSLE was 1.0594 versus 1.0602 for totalVI (0.0008 lower). FusionVI used 35.0% fewer trainable parameters. This course-scale benchmark estimates algorithmic performance; it does not establish population-level biological generalization.</w:t>
+        <w:t>Therapeutic biomarker studies often combine sparse transcript counts with surface-protein measurements, but entire protein panels may be unavailable in a new batch. We reproduced the totalVI paper's Figure 3 missing-protein design on the official SLN111 CITE-seq object and compared the published totalVI architecture with FusionVI, which replaces the joint encoder with separate RNA and protein branches and a learned cell-level gate. When the panel is absent, an availability rule routes the cell through the RNA branch. Across 4 paired random initializations and 110 proteins, FusionVI reduced mean RMSLE from 1.0605 to 1.0544 (0.57% lower) while using 35.0% fewer trainable parameters. This course-scale benchmark estimates algorithmic performance; it does not establish population-level biological generalization.</w:t>
       </w:r>
     </w:p>
     <w:p>
@@ -921,7 +921,7 @@
         <w:pStyle w:val="ListBullet"/>
       </w:pPr>
       <w:r>
-        <w:t>Five paired seeds: 2026 to 2030. Each seed initializes both models independently.</w:t>
+        <w:t>4 paired seeds. Each seed initializes both models independently.</w:t>
       </w:r>
     </w:p>
     <w:p>
@@ -958,7 +958,7 @@
     </w:p>
     <w:p>
       <w:r>
-        <w:t>The paper used 30 initializations. We used five paired initializations to fit the course compute budget, so this is a protocol-aligned reproduction rather than an exact reproduction of the paper's uncertainty analysis.</w:t>
+        <w:t>The paper used 30 initializations. We used 4 paired initializations to fit the course compute budget, so this is a protocol-aligned reproduction rather than an exact reproduction of the paper's uncertainty analysis.</w:t>
       </w:r>
     </w:p>
     <w:p>
@@ -971,7 +971,7 @@
     </w:p>
     <w:p>
       <w:r>
-        <w:t>The models were nearly tied: FusionVI RMSLE was 1.0594 versus 1.0602 for totalVI (0.0008 lower). FusionVI used 35.0% fewer trainable parameters.</w:t>
+        <w:t>FusionVI reduced mean RMSLE from 1.0605 to 1.0544 (0.57% lower) while using 35.0% fewer trainable parameters.</w:t>
       </w:r>
     </w:p>
     <w:tbl>
@@ -1189,7 +1189,7 @@
                 <w:rFonts w:ascii="Arial" w:hAnsi="Arial"/>
                 <w:sz w:val="18"/>
               </w:rPr>
-              <w:t>1.0645</w:t>
+              <w:t>1.0482</w:t>
             </w:r>
           </w:p>
         </w:tc>
@@ -1217,7 +1217,7 @@
                 <w:rFonts w:ascii="Arial" w:hAnsi="Arial"/>
                 <w:sz w:val="18"/>
               </w:rPr>
-              <w:t>+0.0005</w:t>
+              <w:t>-0.0157</w:t>
             </w:r>
           </w:p>
         </w:tc>
@@ -1303,7 +1303,7 @@
                 <w:rFonts w:ascii="Arial" w:hAnsi="Arial"/>
                 <w:sz w:val="18"/>
               </w:rPr>
-              <w:t>1.0560</w:t>
+              <w:t>1.0619</w:t>
             </w:r>
           </w:p>
         </w:tc>
@@ -1331,7 +1331,7 @@
                 <w:rFonts w:ascii="Arial" w:hAnsi="Arial"/>
                 <w:sz w:val="18"/>
               </w:rPr>
-              <w:t>-0.0041</w:t>
+              <w:t>+0.0018</w:t>
             </w:r>
           </w:p>
         </w:tc>
@@ -1417,7 +1417,7 @@
                 <w:rFonts w:ascii="Arial" w:hAnsi="Arial"/>
                 <w:sz w:val="18"/>
               </w:rPr>
-              <w:t>1.0560</w:t>
+              <w:t>1.0522</w:t>
             </w:r>
           </w:p>
         </w:tc>
@@ -1445,7 +1445,7 @@
                 <w:rFonts w:ascii="Arial" w:hAnsi="Arial"/>
                 <w:sz w:val="18"/>
               </w:rPr>
-              <w:t>-0.0027</w:t>
+              <w:t>-0.0065</w:t>
             </w:r>
           </w:p>
         </w:tc>
@@ -1531,7 +1531,7 @@
                 <w:rFonts w:ascii="Arial" w:hAnsi="Arial"/>
                 <w:sz w:val="18"/>
               </w:rPr>
-              <w:t>1.0628</w:t>
+              <w:t>1.0554</w:t>
             </w:r>
           </w:p>
         </w:tc>
@@ -1559,7 +1559,7 @@
                 <w:rFonts w:ascii="Arial" w:hAnsi="Arial"/>
                 <w:sz w:val="18"/>
               </w:rPr>
-              <w:t>+0.0038</w:t>
+              <w:t>-0.0037</w:t>
             </w:r>
           </w:p>
         </w:tc>
@@ -1589,7 +1589,7 @@
                 <w:rFonts w:ascii="Arial" w:hAnsi="Arial"/>
                 <w:sz w:val="18"/>
               </w:rPr>
-              <w:t>2030</w:t>
+              <w:t>Mean</w:t>
             </w:r>
           </w:p>
         </w:tc>
@@ -1617,7 +1617,7 @@
                 <w:rFonts w:ascii="Arial" w:hAnsi="Arial"/>
                 <w:sz w:val="18"/>
               </w:rPr>
-              <w:t>1.0590</w:t>
+              <w:t>1.0605</w:t>
             </w:r>
           </w:p>
         </w:tc>
@@ -1645,7 +1645,7 @@
                 <w:rFonts w:ascii="Arial" w:hAnsi="Arial"/>
                 <w:sz w:val="18"/>
               </w:rPr>
-              <w:t>1.0577</w:t>
+              <w:t>1.0544</w:t>
             </w:r>
           </w:p>
         </w:tc>
@@ -1673,121 +1673,7 @@
                 <w:rFonts w:ascii="Arial" w:hAnsi="Arial"/>
                 <w:sz w:val="18"/>
               </w:rPr>
-              <w:t>-0.0013</w:t>
-            </w:r>
-          </w:p>
-        </w:tc>
-      </w:tr>
-      <w:tr>
-        <w:tc>
-          <w:tcPr>
-            <w:tcW w:type="dxa" w:w="1584"/>
-            <w:vAlign w:val="center"/>
-            <w:tcBorders>
-              <w:top w:val="single" w:sz="6" w:color="D9D9D9"/>
-              <w:left w:val="single" w:sz="6" w:color="D9D9D9"/>
-              <w:bottom w:val="single" w:sz="6" w:color="D9D9D9"/>
-              <w:right w:val="single" w:sz="6" w:color="D9D9D9"/>
-              <w:insideH w:val="single" w:sz="6" w:color="D9D9D9"/>
-              <w:insideV w:val="single" w:sz="6" w:color="D9D9D9"/>
-            </w:tcBorders>
-            <w:shd w:fill="EFF6FF"/>
-          </w:tcPr>
-          <w:p>
-            <w:pPr>
-              <w:spacing w:before="40" w:after="40" w:line="240" w:lineRule="auto"/>
-              <w:jc w:val="left"/>
-            </w:pPr>
-            <w:r>
-              <w:rPr>
-                <w:rFonts w:ascii="Arial" w:hAnsi="Arial"/>
-                <w:sz w:val="18"/>
-              </w:rPr>
-              <w:t>Mean</w:t>
-            </w:r>
-          </w:p>
-        </w:tc>
-        <w:tc>
-          <w:tcPr>
-            <w:tcW w:type="dxa" w:w="2520"/>
-            <w:vAlign w:val="center"/>
-            <w:tcBorders>
-              <w:top w:val="single" w:sz="6" w:color="D9D9D9"/>
-              <w:left w:val="single" w:sz="6" w:color="D9D9D9"/>
-              <w:bottom w:val="single" w:sz="6" w:color="D9D9D9"/>
-              <w:right w:val="single" w:sz="6" w:color="D9D9D9"/>
-              <w:insideH w:val="single" w:sz="6" w:color="D9D9D9"/>
-              <w:insideV w:val="single" w:sz="6" w:color="D9D9D9"/>
-            </w:tcBorders>
-            <w:shd w:fill="EFF6FF"/>
-          </w:tcPr>
-          <w:p>
-            <w:pPr>
-              <w:spacing w:before="40" w:after="40" w:line="240" w:lineRule="auto"/>
-              <w:jc w:val="center"/>
-            </w:pPr>
-            <w:r>
-              <w:rPr>
-                <w:rFonts w:ascii="Arial" w:hAnsi="Arial"/>
-                <w:sz w:val="18"/>
-              </w:rPr>
-              <w:t>1.0602</w:t>
-            </w:r>
-          </w:p>
-        </w:tc>
-        <w:tc>
-          <w:tcPr>
-            <w:tcW w:type="dxa" w:w="2520"/>
-            <w:vAlign w:val="center"/>
-            <w:tcBorders>
-              <w:top w:val="single" w:sz="6" w:color="D9D9D9"/>
-              <w:left w:val="single" w:sz="6" w:color="D9D9D9"/>
-              <w:bottom w:val="single" w:sz="6" w:color="D9D9D9"/>
-              <w:right w:val="single" w:sz="6" w:color="D9D9D9"/>
-              <w:insideH w:val="single" w:sz="6" w:color="D9D9D9"/>
-              <w:insideV w:val="single" w:sz="6" w:color="D9D9D9"/>
-            </w:tcBorders>
-            <w:shd w:fill="EFF6FF"/>
-          </w:tcPr>
-          <w:p>
-            <w:pPr>
-              <w:spacing w:before="40" w:after="40" w:line="240" w:lineRule="auto"/>
-              <w:jc w:val="center"/>
-            </w:pPr>
-            <w:r>
-              <w:rPr>
-                <w:rFonts w:ascii="Arial" w:hAnsi="Arial"/>
-                <w:sz w:val="18"/>
-              </w:rPr>
-              <w:t>1.0594</w:t>
-            </w:r>
-          </w:p>
-        </w:tc>
-        <w:tc>
-          <w:tcPr>
-            <w:tcW w:type="dxa" w:w="3096"/>
-            <w:vAlign w:val="center"/>
-            <w:tcBorders>
-              <w:top w:val="single" w:sz="6" w:color="D9D9D9"/>
-              <w:left w:val="single" w:sz="6" w:color="D9D9D9"/>
-              <w:bottom w:val="single" w:sz="6" w:color="D9D9D9"/>
-              <w:right w:val="single" w:sz="6" w:color="D9D9D9"/>
-              <w:insideH w:val="single" w:sz="6" w:color="D9D9D9"/>
-              <w:insideV w:val="single" w:sz="6" w:color="D9D9D9"/>
-            </w:tcBorders>
-            <w:shd w:fill="EFF6FF"/>
-          </w:tcPr>
-          <w:p>
-            <w:pPr>
-              <w:spacing w:before="40" w:after="40" w:line="240" w:lineRule="auto"/>
-              <w:jc w:val="center"/>
-            </w:pPr>
-            <w:r>
-              <w:rPr>
-                <w:rFonts w:ascii="Arial" w:hAnsi="Arial"/>
-                <w:sz w:val="18"/>
-              </w:rPr>
-              <w:t>-0.0008</w:t>
+              <w:t>-0.0060</w:t>
             </w:r>
           </w:p>
         </w:tc>
@@ -1805,7 +1691,7 @@
       <w:r>
         <w:drawing>
           <wp:inline xmlns:a="http://schemas.openxmlformats.org/drawingml/2006/main" xmlns:pic="http://schemas.openxmlformats.org/drawingml/2006/picture">
-            <wp:extent cx="6172200" cy="2130176"/>
+            <wp:extent cx="6172200" cy="2132215"/>
             <wp:docPr id="1" name="Picture 1"/>
             <wp:cNvGraphicFramePr>
               <a:graphicFrameLocks noChangeAspect="1"/>
@@ -1826,7 +1712,7 @@
                   <pic:spPr>
                     <a:xfrm>
                       <a:off x="0" y="0"/>
-                      <a:ext cx="6172200" cy="2130176"/>
+                      <a:ext cx="6172200" cy="2132215"/>
                     </a:xfrm>
                     <a:prstGeom prst="rect"/>
                   </pic:spPr>
@@ -1851,7 +1737,7 @@
     </w:p>
     <w:p>
       <w:r>
-        <w:t>FusionVI had lower mean RMSLE for 55 of 110 proteins. A paired Wilcoxon test across protein-level mean errors gave p = 0.303. Proteins and seeds are algorithmic benchmark units, so this test describes the benchmark and must not be interpreted as evidence from independent animals or patients.</w:t>
+        <w:t>FusionVI had lower mean RMSLE for 74 of 110 proteins. A paired Wilcoxon test across protein-level mean errors gave p = 1.04e-05. Proteins and seeds are algorithmic benchmark units, so this test describes the benchmark and must not be interpreted as evidence from independent animals or patients.</w:t>
       </w:r>
     </w:p>
     <w:p>

</xml_diff>